<commit_message>
docs: GK-105 prepara o fechamento da Release 1 e os papéis da Release 2
US: GK-105 [US-105] Planilhas da disciplina: DoD, Plano de Qualidade e Análise de Riscos

- Plano de Teste v1.1: status dos 30 casos a partir do CI da main
  (30/30 aprovados) e métricas da Sprint 1; Q-08 em 100%.
- Release Notes e Relatório de Qualidade R1 preenchidos com os dados
  de 28/10; novos Relatório de Métricas (velocity, burndown) e
  Relatório do Pipeline.
- Ata da Review com pauta e dados; presença, demonstração e feedback
  ficam para a reunião de 29/10.
- README com os papéis da Release 2 (Pedro SM, Wagner PO e DevOps,
  Rodrigo QA) e a passagem de bastão.
- DoD e Plano de Qualidade atualizados com o aceite do PO, o backlog
  repriorizado, a DoR da Release 2 e os relatórios da release.
</commit_message>
<xml_diff>
--- a/docs/Plano-de-Teste.docx
+++ b/docs/Plano-de-Teste.docx
@@ -779,7 +779,7 @@
                 <w:color w:val="4F81BD"/>
                 <w:sz w:val="20"/>
               </w:rPr>
-              <w:t xml:space="preserve"/>
+              <w:t>28/10/2026</w:t>
             </w:r>
           </w:p>
         </w:tc>
@@ -816,7 +816,7 @@
                 <w:sz w:val="20"/>
                 <w:lang w:eastAsia="pt-BR"/>
               </w:rPr>
-              <w:t xml:space="preserve"/>
+              <w:t>1.1</w:t>
             </w:r>
           </w:p>
         </w:tc>
@@ -854,7 +854,7 @@
                 <w:sz w:val="20"/>
                 <w:lang w:eastAsia="pt-BR"/>
               </w:rPr>
-              <w:t xml:space="preserve"/>
+              <w:t>R1 / S1</w:t>
             </w:r>
           </w:p>
         </w:tc>
@@ -891,7 +891,7 @@
                 <w:sz w:val="20"/>
                 <w:lang w:eastAsia="pt-BR"/>
               </w:rPr>
-              <w:t xml:space="preserve"/>
+              <w:t>Status dos 30 casos e métricas da Sprint 1 a partir do CI da main (ca0235f, run 40687889647: pytest 87/87, Cypress 27/27, integração 9/9); arquivos de teste atualizados para os nomes reais</w:t>
             </w:r>
           </w:p>
         </w:tc>
@@ -927,7 +927,7 @@
                 <w:sz w:val="20"/>
                 <w:lang w:eastAsia="pt-BR"/>
               </w:rPr>
-              <w:t xml:space="preserve"/>
+              <w:t>Pedro Lucas (PO e DevOps), com a confirmação do QA registrada no Jira (GK-80, GK-83)</w:t>
             </w:r>
           </w:p>
         </w:tc>
@@ -5738,7 +5738,7 @@
                       <w:sz w:val="16"/>
                       <w:szCs w:val="16"/>
                     </w:rPr>
-                    <w:t xml:space="preserve">cadastro-cliente.feature</w:t>
+                    <w:t>e2e/cadastro.feature; test_clientes.py</w:t>
                   </w:r>
                 </w:p>
               </w:tc>
@@ -5828,7 +5828,7 @@
                       <w:sz w:val="18"/>
                       <w:szCs w:val="18"/>
                     </w:rPr>
-                    <w:t xml:space="preserve">Pendente</w:t>
+                    <w:t>Passou (CI 28/10)</w:t>
                   </w:r>
                 </w:p>
               </w:tc>
@@ -5887,7 +5887,7 @@
                       <w:sz w:val="16"/>
                       <w:szCs w:val="16"/>
                     </w:rPr>
-                    <w:t xml:space="preserve">cadastro-cliente.feature</w:t>
+                    <w:t>e2e/cadastro.feature; test_clientes.py</w:t>
                   </w:r>
                 </w:p>
               </w:tc>
@@ -5977,7 +5977,7 @@
                       <w:sz w:val="18"/>
                       <w:szCs w:val="18"/>
                     </w:rPr>
-                    <w:t xml:space="preserve">Pendente</w:t>
+                    <w:t>Passou (CI 28/10)</w:t>
                   </w:r>
                 </w:p>
               </w:tc>
@@ -6036,7 +6036,7 @@
                       <w:sz w:val="16"/>
                       <w:szCs w:val="16"/>
                     </w:rPr>
-                    <w:t xml:space="preserve">cadastro-cliente.feature</w:t>
+                    <w:t>e2e/cadastro.feature; test_clientes.py</w:t>
                   </w:r>
                 </w:p>
               </w:tc>
@@ -6126,7 +6126,7 @@
                       <w:sz w:val="18"/>
                       <w:szCs w:val="18"/>
                     </w:rPr>
-                    <w:t xml:space="preserve">Pendente</w:t>
+                    <w:t>Passou (CI 28/10)</w:t>
                   </w:r>
                 </w:p>
               </w:tc>
@@ -6185,7 +6185,7 @@
                       <w:sz w:val="16"/>
                       <w:szCs w:val="16"/>
                     </w:rPr>
-                    <w:t xml:space="preserve">login.feature</w:t>
+                    <w:t>e2e/login.feature; test_autenticacao.py</w:t>
                   </w:r>
                 </w:p>
               </w:tc>
@@ -6275,7 +6275,7 @@
                       <w:sz w:val="18"/>
                       <w:szCs w:val="18"/>
                     </w:rPr>
-                    <w:t xml:space="preserve">Pendente</w:t>
+                    <w:t>Passou (CI 28/10)</w:t>
                   </w:r>
                 </w:p>
               </w:tc>
@@ -6334,7 +6334,7 @@
                       <w:sz w:val="16"/>
                       <w:szCs w:val="16"/>
                     </w:rPr>
-                    <w:t xml:space="preserve">login.feature</w:t>
+                    <w:t>e2e/login.feature; test_autenticacao.py</w:t>
                   </w:r>
                 </w:p>
               </w:tc>
@@ -6424,7 +6424,7 @@
                       <w:sz w:val="18"/>
                       <w:szCs w:val="18"/>
                     </w:rPr>
-                    <w:t xml:space="preserve">Pendente</w:t>
+                    <w:t>Passou (CI 28/10)</w:t>
                   </w:r>
                 </w:p>
               </w:tc>
@@ -6483,7 +6483,7 @@
                       <w:sz w:val="16"/>
                       <w:szCs w:val="16"/>
                     </w:rPr>
-                    <w:t xml:space="preserve">login.feature</w:t>
+                    <w:t>e2e/login.feature; test_autenticacao.py</w:t>
                   </w:r>
                 </w:p>
               </w:tc>
@@ -6573,7 +6573,7 @@
                       <w:sz w:val="18"/>
                       <w:szCs w:val="18"/>
                     </w:rPr>
-                    <w:t xml:space="preserve">Pendente</w:t>
+                    <w:t>Passou (CI 28/10)</w:t>
                   </w:r>
                 </w:p>
               </w:tc>
@@ -6632,7 +6632,7 @@
                       <w:sz w:val="16"/>
                       <w:szCs w:val="16"/>
                     </w:rPr>
-                    <w:t xml:space="preserve">listagem-jogos.feature</w:t>
+                    <w:t>e2e/listagem-jogos.feature; test_catalogo_banco.py</w:t>
                   </w:r>
                 </w:p>
               </w:tc>
@@ -6722,7 +6722,7 @@
                       <w:sz w:val="18"/>
                       <w:szCs w:val="18"/>
                     </w:rPr>
-                    <w:t xml:space="preserve">Pendente</w:t>
+                    <w:t>Passou (CI 28/10)</w:t>
                   </w:r>
                 </w:p>
               </w:tc>
@@ -6781,7 +6781,7 @@
                       <w:sz w:val="16"/>
                       <w:szCs w:val="16"/>
                     </w:rPr>
-                    <w:t xml:space="preserve">listagem-jogos.feature</w:t>
+                    <w:t>e2e/listagem-jogos.feature; test_catalogo_banco.py</w:t>
                   </w:r>
                 </w:p>
               </w:tc>
@@ -6871,7 +6871,7 @@
                       <w:sz w:val="18"/>
                       <w:szCs w:val="18"/>
                     </w:rPr>
-                    <w:t xml:space="preserve">Pendente</w:t>
+                    <w:t>Passou (CI 28/10)</w:t>
                   </w:r>
                 </w:p>
               </w:tc>
@@ -6930,7 +6930,7 @@
                       <w:sz w:val="16"/>
                       <w:szCs w:val="16"/>
                     </w:rPr>
-                    <w:t xml:space="preserve">listagem-jogos.feature</w:t>
+                    <w:t>e2e/detalhe-jogo.feature; test_catalogo_banco.py</w:t>
                   </w:r>
                 </w:p>
               </w:tc>
@@ -7020,7 +7020,7 @@
                       <w:sz w:val="18"/>
                       <w:szCs w:val="18"/>
                     </w:rPr>
-                    <w:t xml:space="preserve">Pendente</w:t>
+                    <w:t>Passou (CI 28/10)</w:t>
                   </w:r>
                 </w:p>
               </w:tc>
@@ -7079,7 +7079,7 @@
                       <w:sz w:val="16"/>
                       <w:szCs w:val="16"/>
                     </w:rPr>
-                    <w:t xml:space="preserve">detalhe-jogo.feature</w:t>
+                    <w:t>e2e/detalhe-jogo.feature; test_detalhe_jogo_banco.py</w:t>
                   </w:r>
                 </w:p>
               </w:tc>
@@ -7169,7 +7169,7 @@
                       <w:sz w:val="18"/>
                       <w:szCs w:val="18"/>
                     </w:rPr>
-                    <w:t xml:space="preserve">Pendente</w:t>
+                    <w:t>Passou (CI 28/10)</w:t>
                   </w:r>
                 </w:p>
               </w:tc>
@@ -7228,7 +7228,7 @@
                       <w:sz w:val="16"/>
                       <w:szCs w:val="16"/>
                     </w:rPr>
-                    <w:t xml:space="preserve">detalhe-jogo.feature</w:t>
+                    <w:t>e2e/listagem-jogos.feature; test_catalogo_banco.py</w:t>
                   </w:r>
                 </w:p>
               </w:tc>
@@ -7318,7 +7318,7 @@
                       <w:sz w:val="18"/>
                       <w:szCs w:val="18"/>
                     </w:rPr>
-                    <w:t xml:space="preserve">Pendente</w:t>
+                    <w:t>Passou (CI 28/10)</w:t>
                   </w:r>
                 </w:p>
               </w:tc>
@@ -7377,7 +7377,7 @@
                       <w:sz w:val="16"/>
                       <w:szCs w:val="16"/>
                     </w:rPr>
-                    <w:t xml:space="preserve">backend/tests/test_senha.py (pytest)</w:t>
+                    <w:t>backend/tests/test_driver_senha_hash.py; test_clientes.py</w:t>
                   </w:r>
                 </w:p>
               </w:tc>
@@ -7467,7 +7467,7 @@
                       <w:sz w:val="18"/>
                       <w:szCs w:val="18"/>
                     </w:rPr>
-                    <w:t xml:space="preserve">Pendente</w:t>
+                    <w:t>Passou (CI 28/10)</w:t>
                   </w:r>
                 </w:p>
               </w:tc>
@@ -7526,7 +7526,7 @@
                       <w:sz w:val="16"/>
                       <w:szCs w:val="16"/>
                     </w:rPr>
-                    <w:t xml:space="preserve">backend/tests/test_senha.py (pytest)</w:t>
+                    <w:t>backend/tests/test_driver_senha_hash.py</w:t>
                   </w:r>
                 </w:p>
               </w:tc>
@@ -7616,7 +7616,7 @@
                       <w:sz w:val="18"/>
                       <w:szCs w:val="18"/>
                     </w:rPr>
-                    <w:t xml:space="preserve">Pendente</w:t>
+                    <w:t>Passou (CI 28/10)</w:t>
                   </w:r>
                 </w:p>
               </w:tc>
@@ -7675,7 +7675,7 @@
                       <w:sz w:val="16"/>
                       <w:szCs w:val="16"/>
                     </w:rPr>
-                    <w:t xml:space="preserve">backend/tests/test_sessao.py (pytest)</w:t>
+                    <w:t>backend/tests/test_autenticacao.py</w:t>
                   </w:r>
                 </w:p>
               </w:tc>
@@ -7765,7 +7765,7 @@
                       <w:sz w:val="18"/>
                       <w:szCs w:val="18"/>
                     </w:rPr>
-                    <w:t xml:space="preserve">Pendente</w:t>
+                    <w:t>Passou (CI 28/10)</w:t>
                   </w:r>
                 </w:p>
               </w:tc>
@@ -7824,7 +7824,7 @@
                       <w:sz w:val="16"/>
                       <w:szCs w:val="16"/>
                     </w:rPr>
-                    <w:t xml:space="preserve">backend/tests/test_sessao.py (pytest)</w:t>
+                    <w:t>backend/tests/test_autenticacao.py</w:t>
                   </w:r>
                 </w:p>
               </w:tc>
@@ -7914,7 +7914,7 @@
                       <w:sz w:val="18"/>
                       <w:szCs w:val="18"/>
                     </w:rPr>
-                    <w:t xml:space="preserve">Pendente</w:t>
+                    <w:t>Passou (CI 28/10)</w:t>
                   </w:r>
                 </w:p>
               </w:tc>
@@ -7973,7 +7973,7 @@
                       <w:sz w:val="16"/>
                       <w:szCs w:val="16"/>
                     </w:rPr>
-                    <w:t xml:space="preserve">backend/tests/test_sessao.py (pytest)</w:t>
+                    <w:t>backend/tests/test_autenticacao.py</w:t>
                   </w:r>
                 </w:p>
               </w:tc>
@@ -8063,7 +8063,7 @@
                       <w:sz w:val="18"/>
                       <w:szCs w:val="18"/>
                     </w:rPr>
-                    <w:t xml:space="preserve">Pendente</w:t>
+                    <w:t>Passou (CI 28/10)</w:t>
                   </w:r>
                 </w:p>
               </w:tc>
@@ -8122,7 +8122,7 @@
                       <w:sz w:val="16"/>
                       <w:szCs w:val="16"/>
                     </w:rPr>
-                    <w:t xml:space="preserve">mensagens-erro.feature</w:t>
+                    <w:t>e2e/cadastro.feature, login.feature; test_clientes.py</w:t>
                   </w:r>
                 </w:p>
               </w:tc>
@@ -8212,7 +8212,7 @@
                       <w:sz w:val="18"/>
                       <w:szCs w:val="18"/>
                     </w:rPr>
-                    <w:t xml:space="preserve">Pendente</w:t>
+                    <w:t>Passou (CI 28/10)</w:t>
                   </w:r>
                 </w:p>
               </w:tc>
@@ -8271,7 +8271,7 @@
                       <w:sz w:val="16"/>
                       <w:szCs w:val="16"/>
                     </w:rPr>
-                    <w:t xml:space="preserve">mensagens-erro.feature</w:t>
+                    <w:t>e2e/listagem-jogos.feature, detalhe-jogo.feature; test_clientes.py</w:t>
                   </w:r>
                 </w:p>
               </w:tc>
@@ -8361,7 +8361,7 @@
                       <w:sz w:val="18"/>
                       <w:szCs w:val="18"/>
                     </w:rPr>
-                    <w:t xml:space="preserve">Pendente</w:t>
+                    <w:t>Passou (CI 28/10)</w:t>
                   </w:r>
                 </w:p>
               </w:tc>
@@ -8420,7 +8420,7 @@
                       <w:sz w:val="16"/>
                       <w:szCs w:val="16"/>
                     </w:rPr>
-                    <w:t xml:space="preserve">backend/tests/test_banco.py (pytest)</w:t>
+                    <w:t>backend/tests/test_estrutura_banco.py</w:t>
                   </w:r>
                 </w:p>
               </w:tc>
@@ -8510,7 +8510,7 @@
                       <w:sz w:val="18"/>
                       <w:szCs w:val="18"/>
                     </w:rPr>
-                    <w:t xml:space="preserve">Pendente</w:t>
+                    <w:t>Passou (CI 28/10)</w:t>
                   </w:r>
                 </w:p>
               </w:tc>
@@ -8569,7 +8569,7 @@
                       <w:sz w:val="16"/>
                       <w:szCs w:val="16"/>
                     </w:rPr>
-                    <w:t xml:space="preserve">backend/tests/test_banco.py (pytest)</w:t>
+                    <w:t>backend/tests/test_estrutura_banco.py; test_clientes_banco.py</w:t>
                   </w:r>
                 </w:p>
               </w:tc>
@@ -8659,7 +8659,7 @@
                       <w:sz w:val="18"/>
                       <w:szCs w:val="18"/>
                     </w:rPr>
-                    <w:t xml:space="preserve">Pendente</w:t>
+                    <w:t>Passou (CI 28/10)</w:t>
                   </w:r>
                 </w:p>
               </w:tc>
@@ -8718,7 +8718,7 @@
                       <w:sz w:val="16"/>
                       <w:szCs w:val="16"/>
                     </w:rPr>
-                    <w:t xml:space="preserve">backend/tests/test_banco.py (pytest)</w:t>
+                    <w:t>backend/tests/test_estrutura_banco.py</w:t>
                   </w:r>
                 </w:p>
               </w:tc>
@@ -8808,7 +8808,7 @@
                       <w:sz w:val="18"/>
                       <w:szCs w:val="18"/>
                     </w:rPr>
-                    <w:t xml:space="preserve">Pendente</w:t>
+                    <w:t>Passou (CI 28/10)</w:t>
                   </w:r>
                 </w:p>
               </w:tc>
@@ -8867,7 +8867,7 @@
                       <w:sz w:val="16"/>
                       <w:szCs w:val="16"/>
                     </w:rPr>
-                    <w:t xml:space="preserve">backend/tests/test_banco.py (pytest)</w:t>
+                    <w:t>backend/tests/test_estrutura_banco.py; test_driver_senha_hash.py</w:t>
                   </w:r>
                 </w:p>
               </w:tc>
@@ -8957,7 +8957,7 @@
                       <w:sz w:val="18"/>
                       <w:szCs w:val="18"/>
                     </w:rPr>
-                    <w:t xml:space="preserve">Pendente</w:t>
+                    <w:t>Passou (CI 28/10)</w:t>
                   </w:r>
                 </w:p>
               </w:tc>
@@ -9016,7 +9016,7 @@
                       <w:sz w:val="16"/>
                       <w:szCs w:val="16"/>
                     </w:rPr>
-                    <w:t xml:space="preserve">backend/tests/test_banco.py (pytest)</w:t>
+                    <w:t>backend/tests/test_seguranca_banco_testes.py</w:t>
                   </w:r>
                 </w:p>
               </w:tc>
@@ -9106,7 +9106,7 @@
                       <w:sz w:val="18"/>
                       <w:szCs w:val="18"/>
                     </w:rPr>
-                    <w:t xml:space="preserve">Pendente</w:t>
+                    <w:t>Passou (CI 28/10)</w:t>
                   </w:r>
                 </w:p>
               </w:tc>
@@ -9165,7 +9165,7 @@
                       <w:sz w:val="16"/>
                       <w:szCs w:val="16"/>
                     </w:rPr>
-                    <w:t xml:space="preserve">backend/tests/test_api_base.py (pytest)</w:t>
+                    <w:t>backend/tests/test_saude.py; ruff no CI</w:t>
                   </w:r>
                 </w:p>
               </w:tc>
@@ -9255,7 +9255,7 @@
                       <w:sz w:val="18"/>
                       <w:szCs w:val="18"/>
                     </w:rPr>
-                    <w:t xml:space="preserve">Pendente</w:t>
+                    <w:t>Passou (CI 28/10)</w:t>
                   </w:r>
                 </w:p>
               </w:tc>
@@ -9314,7 +9314,7 @@
                       <w:sz w:val="16"/>
                       <w:szCs w:val="16"/>
                     </w:rPr>
-                    <w:t xml:space="preserve">backend/tests/test_api_base.py (pytest)</w:t>
+                    <w:t>backend/tests/test_saude.py (smoke)</w:t>
                   </w:r>
                 </w:p>
               </w:tc>
@@ -9404,7 +9404,7 @@
                       <w:sz w:val="18"/>
                       <w:szCs w:val="18"/>
                     </w:rPr>
-                    <w:t xml:space="preserve">Pendente</w:t>
+                    <w:t>Passou (CI 28/10)</w:t>
                   </w:r>
                 </w:p>
               </w:tc>
@@ -9463,7 +9463,7 @@
                       <w:sz w:val="16"/>
                       <w:szCs w:val="16"/>
                     </w:rPr>
-                    <w:t xml:space="preserve">backend/tests/test_api_base.py (pytest)</w:t>
+                    <w:t>backend/tests/test_banco.py (smoke)</w:t>
                   </w:r>
                 </w:p>
               </w:tc>
@@ -9553,7 +9553,7 @@
                       <w:sz w:val="18"/>
                       <w:szCs w:val="18"/>
                     </w:rPr>
-                    <w:t xml:space="preserve">Pendente</w:t>
+                    <w:t>Passou (CI 28/10)</w:t>
                   </w:r>
                 </w:p>
               </w:tc>
@@ -9612,7 +9612,7 @@
                       <w:sz w:val="16"/>
                       <w:szCs w:val="16"/>
                     </w:rPr>
-                    <w:t xml:space="preserve">backend/tests/test_api_base.py (pytest)</w:t>
+                    <w:t>backend/tests/test_banco.py (smoke)</w:t>
                   </w:r>
                 </w:p>
               </w:tc>
@@ -9702,7 +9702,7 @@
                       <w:sz w:val="18"/>
                       <w:szCs w:val="18"/>
                     </w:rPr>
-                    <w:t xml:space="preserve">Pendente</w:t>
+                    <w:t>Passou (CI 28/10)</w:t>
                   </w:r>
                 </w:p>
               </w:tc>
@@ -9761,7 +9761,7 @@
                       <w:sz w:val="16"/>
                       <w:szCs w:val="16"/>
                     </w:rPr>
-                    <w:t xml:space="preserve">backend/tests/test_api_base.py (pytest)</w:t>
+                    <w:t>backend/tests/test_saude.py; test_autenticacao.py</w:t>
                   </w:r>
                 </w:p>
               </w:tc>
@@ -9851,7 +9851,7 @@
                       <w:sz w:val="18"/>
                       <w:szCs w:val="18"/>
                     </w:rPr>
-                    <w:t xml:space="preserve">Pendente</w:t>
+                    <w:t>Passou (CI 28/10)</w:t>
                   </w:r>
                 </w:p>
               </w:tc>
@@ -9910,7 +9910,7 @@
                       <w:sz w:val="16"/>
                       <w:szCs w:val="16"/>
                     </w:rPr>
-                    <w:t xml:space="preserve">backend/tests/test_api_base.py (pytest)</w:t>
+                    <w:t>backend/tests/test_banco.py</w:t>
                   </w:r>
                 </w:p>
               </w:tc>
@@ -10000,7 +10000,7 @@
                       <w:sz w:val="18"/>
                       <w:szCs w:val="18"/>
                     </w:rPr>
-                    <w:t xml:space="preserve">Pendente</w:t>
+                    <w:t>Passou (CI 28/10)</w:t>
                   </w:r>
                 </w:p>
               </w:tc>
@@ -10059,7 +10059,7 @@
                       <w:sz w:val="16"/>
                       <w:szCs w:val="16"/>
                     </w:rPr>
-                    <w:t xml:space="preserve">backend/tests/test_api_base.py (pytest)</w:t>
+                    <w:t>backend/tests/test_saude.py; test_catalogo.py</w:t>
                   </w:r>
                 </w:p>
               </w:tc>
@@ -10149,7 +10149,7 @@
                       <w:sz w:val="18"/>
                       <w:szCs w:val="18"/>
                     </w:rPr>
-                    <w:t xml:space="preserve">Pendente</w:t>
+                    <w:t>Passou (CI 28/10)</w:t>
                   </w:r>
                 </w:p>
               </w:tc>
@@ -11972,6 +11972,9 @@
                   <w:pPr>
                     <w:spacing w:before="40" w:after="40" w:line="264" w:lineRule="auto"/>
                   </w:pPr>
+                  <w:r>
+                    <w:t>30</w:t>
+                  </w:r>
                 </w:p>
               </w:tc>
               <w:tc>
@@ -12025,6 +12028,9 @@
                   <w:pPr>
                     <w:spacing w:before="40" w:after="40" w:line="264" w:lineRule="auto"/>
                   </w:pPr>
+                  <w:r>
+                    <w:t>30</w:t>
+                  </w:r>
                 </w:p>
               </w:tc>
               <w:tc>
@@ -12078,6 +12084,9 @@
                   <w:pPr>
                     <w:spacing w:before="40" w:after="40" w:line="264" w:lineRule="auto"/>
                   </w:pPr>
+                  <w:r>
+                    <w:t>30 / 0</w:t>
+                  </w:r>
                 </w:p>
               </w:tc>
               <w:tc>
@@ -12131,6 +12140,9 @@
                   <w:pPr>
                     <w:spacing w:before="40" w:after="40" w:line="264" w:lineRule="auto"/>
                   </w:pPr>
+                  <w:r>
+                    <w:t>100%</w:t>
+                  </w:r>
                 </w:p>
               </w:tc>
               <w:tc>
@@ -12184,6 +12196,9 @@
                   <w:pPr>
                     <w:spacing w:before="40" w:after="40" w:line="264" w:lineRule="auto"/>
                   </w:pPr>
+                  <w:r>
+                    <w:t>0 (GK-106, Alta, corrigido)</w:t>
+                  </w:r>
                 </w:p>
               </w:tc>
               <w:tc>
@@ -12431,7 +12446,7 @@
                 <w:sz w:val="20"/>
                 <w:szCs w:val="20"/>
               </w:rPr>
-              <w:t>[   ]  Cenário piloto (</w:t>
+              <w:t>[ X ]  Cenário piloto (</w:t>
             </w:r>
             <w:r>
               <w:rPr>
@@ -12462,7 +12477,7 @@
                 <w:sz w:val="20"/>
                 <w:szCs w:val="20"/>
               </w:rPr>
-              <w:t xml:space="preserve">[  </w:t>
+              <w:t>[ X ]  Plano salvo em docs/ e no Jira/ Azure</w:t>
             </w:r>
             <w:proofErr w:type="gramEnd"/>
             <w:r>
@@ -12471,7 +12486,6 @@
                 <w:sz w:val="20"/>
                 <w:szCs w:val="20"/>
               </w:rPr>
-              <w:t xml:space="preserve"> </w:t>
             </w:r>
             <w:proofErr w:type="gramStart"/>
             <w:r>
@@ -12480,7 +12494,6 @@
                 <w:sz w:val="20"/>
                 <w:szCs w:val="20"/>
               </w:rPr>
-              <w:t>]  Plano</w:t>
             </w:r>
             <w:proofErr w:type="gramEnd"/>
             <w:r>
@@ -12489,7 +12502,6 @@
                 <w:sz w:val="20"/>
                 <w:szCs w:val="20"/>
               </w:rPr>
-              <w:t xml:space="preserve"> salvo em </w:t>
             </w:r>
             <w:r>
               <w:rPr>
@@ -12497,7 +12509,6 @@
                 <w:sz w:val="18"/>
                 <w:szCs w:val="18"/>
               </w:rPr>
-              <w:t>docs/</w:t>
             </w:r>
             <w:r>
               <w:rPr>
@@ -12505,7 +12516,6 @@
                 <w:sz w:val="20"/>
                 <w:szCs w:val="20"/>
               </w:rPr>
-              <w:t xml:space="preserve"> e </w:t>
             </w:r>
             <w:r>
               <w:rPr>
@@ -12513,7 +12523,6 @@
                 <w:sz w:val="20"/>
                 <w:szCs w:val="20"/>
               </w:rPr>
-              <w:t xml:space="preserve">no </w:t>
             </w:r>
             <w:proofErr w:type="spellStart"/>
             <w:r>
@@ -12522,7 +12531,6 @@
                 <w:sz w:val="20"/>
                 <w:szCs w:val="20"/>
               </w:rPr>
-              <w:t>Jira</w:t>
             </w:r>
             <w:proofErr w:type="spellEnd"/>
             <w:r>
@@ -12531,7 +12539,6 @@
                 <w:sz w:val="20"/>
                 <w:szCs w:val="20"/>
               </w:rPr>
-              <w:t>/ Azure</w:t>
             </w:r>
           </w:p>
         </w:tc>

</xml_diff>